<commit_message>
Avances del manual de usuario
</commit_message>
<xml_diff>
--- a/Manual de usuario..docx
+++ b/Manual de usuario..docx
@@ -907,7 +907,7 @@
           </mc:Choice>
           <mc:Fallback>
             <w:pict>
-              <v:shapetype w14:anchorId="1B6214D5" id="_x0000_t32" coordsize="21600,21600" o:spt="32" o:oned="t" path="m,l21600,21600e" filled="f">
+              <v:shapetype w14:anchorId="64972AA4" id="_x0000_t32" coordsize="21600,21600" o:spt="32" o:oned="t" path="m,l21600,21600e" filled="f">
                 <v:path arrowok="t" fillok="f" o:connecttype="none"/>
                 <o:lock v:ext="edit" shapetype="t"/>
               </v:shapetype>
@@ -1114,7 +1114,7 @@
           </mc:Choice>
           <mc:Fallback>
             <w:pict>
-              <v:shape w14:anchorId="0FD325F8" id="Conector recto de flecha 5" o:spid="_x0000_s1026" type="#_x0000_t32" style="position:absolute;margin-left:3in;margin-top:10.25pt;width:141pt;height:91.5pt;z-index:251644416;visibility:visible;mso-wrap-style:square;mso-width-percent:0;mso-height-percent:0;mso-wrap-distance-left:9pt;mso-wrap-distance-top:0;mso-wrap-distance-right:9pt;mso-wrap-distance-bottom:0;mso-position-horizontal:absolute;mso-position-horizontal-relative:text;mso-position-vertical:absolute;mso-position-vertical-relative:text;mso-width-percent:0;mso-height-percent:0;mso-width-relative:margin;mso-height-relative:margin" o:gfxdata="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" strokecolor="#e97132 [3205]" strokeweight="1.5pt">
+              <v:shape w14:anchorId="47FFF96B" id="Conector recto de flecha 5" o:spid="_x0000_s1026" type="#_x0000_t32" style="position:absolute;margin-left:3in;margin-top:10.25pt;width:141pt;height:91.5pt;z-index:251644416;visibility:visible;mso-wrap-style:square;mso-width-percent:0;mso-height-percent:0;mso-wrap-distance-left:9pt;mso-wrap-distance-top:0;mso-wrap-distance-right:9pt;mso-wrap-distance-bottom:0;mso-position-horizontal:absolute;mso-position-horizontal-relative:text;mso-position-vertical:absolute;mso-position-vertical-relative:text;mso-width-percent:0;mso-height-percent:0;mso-width-relative:margin;mso-height-relative:margin" o:gfxdata="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" strokecolor="#e97132 [3205]" strokeweight="1.5pt">
                 <v:stroke endarrow="block" joinstyle="miter"/>
               </v:shape>
             </w:pict>
@@ -1178,7 +1178,7 @@
           </mc:Choice>
           <mc:Fallback>
             <w:pict>
-              <v:line w14:anchorId="5D4E3F5A" id="Conector recto 23" o:spid="_x0000_s1026" style="position:absolute;z-index:251687424;visibility:visible;mso-wrap-style:square;mso-wrap-distance-left:9pt;mso-wrap-distance-top:0;mso-wrap-distance-right:9pt;mso-wrap-distance-bottom:0;mso-position-horizontal:absolute;mso-position-horizontal-relative:text;mso-position-vertical:absolute;mso-position-vertical-relative:text" from="1pt,10.25pt" to="3in,10.25pt" o:gfxdata="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" strokecolor="#e97132 [3205]" strokeweight="1.5pt">
+              <v:line w14:anchorId="1309098B" id="Conector recto 23" o:spid="_x0000_s1026" style="position:absolute;z-index:251687424;visibility:visible;mso-wrap-style:square;mso-wrap-distance-left:9pt;mso-wrap-distance-top:0;mso-wrap-distance-right:9pt;mso-wrap-distance-bottom:0;mso-position-horizontal:absolute;mso-position-horizontal-relative:text;mso-position-vertical:absolute;mso-position-vertical-relative:text" from="1pt,10.25pt" to="3in,10.25pt" o:gfxdata="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" strokecolor="#e97132 [3205]" strokeweight="1.5pt">
                 <v:stroke joinstyle="miter"/>
               </v:line>
             </w:pict>
@@ -1343,7 +1343,7 @@
           </mc:Choice>
           <mc:Fallback>
             <w:pict>
-              <v:shape w14:anchorId="3D50DA88" id="Conector recto de flecha 6" o:spid="_x0000_s1026" type="#_x0000_t32" style="position:absolute;margin-left:213.5pt;margin-top:7.85pt;width:143.5pt;height:43.5pt;flip:y;z-index:251649536;visibility:visible;mso-wrap-style:square;mso-width-percent:0;mso-height-percent:0;mso-wrap-distance-left:9pt;mso-wrap-distance-top:0;mso-wrap-distance-right:9pt;mso-wrap-distance-bottom:0;mso-position-horizontal:absolute;mso-position-horizontal-relative:text;mso-position-vertical:absolute;mso-position-vertical-relative:text;mso-width-percent:0;mso-height-percent:0;mso-width-relative:margin;mso-height-relative:margin" o:gfxdata="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" strokecolor="#e97132 [3205]" strokeweight="1.5pt">
+              <v:shape w14:anchorId="65CEECE4" id="Conector recto de flecha 6" o:spid="_x0000_s1026" type="#_x0000_t32" style="position:absolute;margin-left:213.5pt;margin-top:7.85pt;width:143.5pt;height:43.5pt;flip:y;z-index:251649536;visibility:visible;mso-wrap-style:square;mso-width-percent:0;mso-height-percent:0;mso-wrap-distance-left:9pt;mso-wrap-distance-top:0;mso-wrap-distance-right:9pt;mso-wrap-distance-bottom:0;mso-position-horizontal:absolute;mso-position-horizontal-relative:text;mso-position-vertical:absolute;mso-position-vertical-relative:text;mso-width-percent:0;mso-height-percent:0;mso-width-relative:margin;mso-height-relative:margin" o:gfxdata="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" strokecolor="#e97132 [3205]" strokeweight="1.5pt">
                 <v:stroke endarrow="block" joinstyle="miter"/>
               </v:shape>
             </w:pict>
@@ -1442,7 +1442,7 @@
           </mc:Choice>
           <mc:Fallback>
             <w:pict>
-              <v:line w14:anchorId="36A5BE50" id="Conector recto 24" o:spid="_x0000_s1026" style="position:absolute;z-index:251695104;visibility:visible;mso-wrap-style:square;mso-wrap-distance-left:9pt;mso-wrap-distance-top:0;mso-wrap-distance-right:9pt;mso-wrap-distance-bottom:0;mso-position-horizontal:absolute;mso-position-horizontal-relative:text;mso-position-vertical:absolute;mso-position-vertical-relative:text" from="1pt,7.75pt" to="213.5pt,7.75pt" o:gfxdata="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" strokecolor="#e97132 [3205]" strokeweight="1.5pt">
+              <v:line w14:anchorId="28983F30" id="Conector recto 24" o:spid="_x0000_s1026" style="position:absolute;z-index:251695104;visibility:visible;mso-wrap-style:square;mso-wrap-distance-left:9pt;mso-wrap-distance-top:0;mso-wrap-distance-right:9pt;mso-wrap-distance-bottom:0;mso-position-horizontal:absolute;mso-position-horizontal-relative:text;mso-position-vertical:absolute;mso-position-vertical-relative:text" from="1pt,7.75pt" to="213.5pt,7.75pt" o:gfxdata="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" strokecolor="#e97132 [3205]" strokeweight="1.5pt">
                 <v:stroke joinstyle="miter"/>
               </v:line>
             </w:pict>
@@ -1786,7 +1786,7 @@
           </mc:Choice>
           <mc:Fallback>
             <w:pict>
-              <v:shape w14:anchorId="5F935736" id="Conector recto de flecha 22" o:spid="_x0000_s1026" type="#_x0000_t32" style="position:absolute;margin-left:210.5pt;margin-top:20.45pt;width:55.5pt;height:0;z-index:251693056;visibility:visible;mso-wrap-style:square;mso-wrap-distance-left:9pt;mso-wrap-distance-top:0;mso-wrap-distance-right:9pt;mso-wrap-distance-bottom:0;mso-position-horizontal:absolute;mso-position-horizontal-relative:text;mso-position-vertical:absolute;mso-position-vertical-relative:text" o:gfxdata="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" strokecolor="black [3200]" strokeweight="1.5pt">
+              <v:shape w14:anchorId="033C1950" id="Conector recto de flecha 22" o:spid="_x0000_s1026" type="#_x0000_t32" style="position:absolute;margin-left:210.5pt;margin-top:20.45pt;width:55.5pt;height:0;z-index:251693056;visibility:visible;mso-wrap-style:square;mso-wrap-distance-left:9pt;mso-wrap-distance-top:0;mso-wrap-distance-right:9pt;mso-wrap-distance-bottom:0;mso-position-horizontal:absolute;mso-position-horizontal-relative:text;mso-position-vertical:absolute;mso-position-vertical-relative:text" o:gfxdata="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" strokecolor="black [3200]" strokeweight="1.5pt">
                 <v:stroke endarrow="block" joinstyle="miter"/>
               </v:shape>
             </w:pict>
@@ -1880,7 +1880,7 @@
           </mc:Choice>
           <mc:Fallback>
             <w:pict>
-              <v:shape w14:anchorId="4EA3DC2A" id="Conector recto de flecha 9" o:spid="_x0000_s1026" type="#_x0000_t32" style="position:absolute;margin-left:222.5pt;margin-top:12.2pt;width:124.5pt;height:3.6pt;z-index:251660800;visibility:visible;mso-wrap-style:square;mso-width-percent:0;mso-height-percent:0;mso-wrap-distance-left:9pt;mso-wrap-distance-top:0;mso-wrap-distance-right:9pt;mso-wrap-distance-bottom:0;mso-position-horizontal:absolute;mso-position-horizontal-relative:text;mso-position-vertical:absolute;mso-position-vertical-relative:text;mso-width-percent:0;mso-height-percent:0;mso-width-relative:margin;mso-height-relative:margin" o:gfxdata="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" strokecolor="#196b24 [3206]" strokeweight="1.5pt">
+              <v:shape w14:anchorId="1F9D3680" id="Conector recto de flecha 9" o:spid="_x0000_s1026" type="#_x0000_t32" style="position:absolute;margin-left:222.5pt;margin-top:12.2pt;width:124.5pt;height:3.6pt;z-index:251660800;visibility:visible;mso-wrap-style:square;mso-width-percent:0;mso-height-percent:0;mso-wrap-distance-left:9pt;mso-wrap-distance-top:0;mso-wrap-distance-right:9pt;mso-wrap-distance-bottom:0;mso-position-horizontal:absolute;mso-position-horizontal-relative:text;mso-position-vertical:absolute;mso-position-vertical-relative:text;mso-width-percent:0;mso-height-percent:0;mso-width-relative:margin;mso-height-relative:margin" o:gfxdata="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" strokecolor="#196b24 [3206]" strokeweight="1.5pt">
                 <v:stroke endarrow="block" joinstyle="miter"/>
               </v:shape>
             </w:pict>
@@ -1950,7 +1950,7 @@
           </mc:Choice>
           <mc:Fallback>
             <w:pict>
-              <v:line w14:anchorId="18426243" id="Conector recto 13" o:spid="_x0000_s1026" style="position:absolute;flip:y;z-index:251676160;visibility:visible;mso-wrap-style:square;mso-width-percent:0;mso-height-percent:0;mso-wrap-distance-left:9pt;mso-wrap-distance-top:0;mso-wrap-distance-right:9pt;mso-wrap-distance-bottom:0;mso-position-horizontal:absolute;mso-position-horizontal-relative:text;mso-position-vertical:absolute;mso-position-vertical-relative:text;mso-width-percent:0;mso-height-percent:0;mso-width-relative:margin;mso-height-relative:margin" from=".5pt,12.25pt" to="223pt,12.25pt" o:gfxdata="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" strokecolor="#196b24 [3206]" strokeweight="1.5pt">
+              <v:line w14:anchorId="56C9D512" id="Conector recto 13" o:spid="_x0000_s1026" style="position:absolute;flip:y;z-index:251676160;visibility:visible;mso-wrap-style:square;mso-width-percent:0;mso-height-percent:0;mso-wrap-distance-left:9pt;mso-wrap-distance-top:0;mso-wrap-distance-right:9pt;mso-wrap-distance-bottom:0;mso-position-horizontal:absolute;mso-position-horizontal-relative:text;mso-position-vertical:absolute;mso-position-vertical-relative:text;mso-width-percent:0;mso-height-percent:0;mso-width-relative:margin;mso-height-relative:margin" from=".5pt,12.25pt" to="223pt,12.25pt" o:gfxdata="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" strokecolor="#196b24 [3206]" strokeweight="1.5pt">
                 <v:stroke joinstyle="miter"/>
               </v:line>
             </w:pict>
@@ -2058,7 +2058,7 @@
           </mc:Choice>
           <mc:Fallback>
             <w:pict>
-              <v:shape w14:anchorId="0C45DB48" id="Conector recto de flecha 10" o:spid="_x0000_s1026" type="#_x0000_t32" style="position:absolute;margin-left:222.5pt;margin-top:2.05pt;width:124.5pt;height:10pt;flip:y;z-index:251668992;visibility:visible;mso-wrap-style:square;mso-width-percent:0;mso-height-percent:0;mso-wrap-distance-left:9pt;mso-wrap-distance-top:0;mso-wrap-distance-right:9pt;mso-wrap-distance-bottom:0;mso-position-horizontal:absolute;mso-position-horizontal-relative:text;mso-position-vertical:absolute;mso-position-vertical-relative:text;mso-width-percent:0;mso-height-percent:0;mso-width-relative:margin;mso-height-relative:margin" o:gfxdata="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" strokecolor="#196b24 [3206]" strokeweight="1.5pt">
+              <v:shape w14:anchorId="748D9F4D" id="Conector recto de flecha 10" o:spid="_x0000_s1026" type="#_x0000_t32" style="position:absolute;margin-left:222.5pt;margin-top:2.05pt;width:124.5pt;height:10pt;flip:y;z-index:251668992;visibility:visible;mso-wrap-style:square;mso-width-percent:0;mso-height-percent:0;mso-wrap-distance-left:9pt;mso-wrap-distance-top:0;mso-wrap-distance-right:9pt;mso-wrap-distance-bottom:0;mso-position-horizontal:absolute;mso-position-horizontal-relative:text;mso-position-vertical:absolute;mso-position-vertical-relative:text;mso-width-percent:0;mso-height-percent:0;mso-width-relative:margin;mso-height-relative:margin" o:gfxdata="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" strokecolor="#196b24 [3206]" strokeweight="1.5pt">
                 <v:stroke endarrow="block" joinstyle="miter"/>
               </v:shape>
             </w:pict>
@@ -2128,7 +2128,7 @@
           </mc:Choice>
           <mc:Fallback>
             <w:pict>
-              <v:line w14:anchorId="40EBB632" id="Conector recto 14" o:spid="_x0000_s1026" style="position:absolute;flip:y;z-index:251677184;visibility:visible;mso-wrap-style:square;mso-width-percent:0;mso-height-percent:0;mso-wrap-distance-left:9pt;mso-wrap-distance-top:0;mso-wrap-distance-right:9pt;mso-wrap-distance-bottom:0;mso-position-horizontal:absolute;mso-position-horizontal-relative:text;mso-position-vertical:absolute;mso-position-vertical-relative:text;mso-width-percent:0;mso-height-percent:0;mso-width-relative:margin;mso-height-relative:margin" from="0,12pt" to="222.5pt,12pt" o:gfxdata="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" strokecolor="#196b24 [3206]" strokeweight="1.5pt">
+              <v:line w14:anchorId="528761AC" id="Conector recto 14" o:spid="_x0000_s1026" style="position:absolute;flip:y;z-index:251677184;visibility:visible;mso-wrap-style:square;mso-width-percent:0;mso-height-percent:0;mso-wrap-distance-left:9pt;mso-wrap-distance-top:0;mso-wrap-distance-right:9pt;mso-wrap-distance-bottom:0;mso-position-horizontal:absolute;mso-position-horizontal-relative:text;mso-position-vertical:absolute;mso-position-vertical-relative:text;mso-width-percent:0;mso-height-percent:0;mso-width-relative:margin;mso-height-relative:margin" from="0,12pt" to="222.5pt,12pt" o:gfxdata="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" strokecolor="#196b24 [3206]" strokeweight="1.5pt">
                 <v:stroke joinstyle="miter"/>
               </v:line>
             </w:pict>
@@ -2207,7 +2207,7 @@
           </mc:Choice>
           <mc:Fallback>
             <w:pict>
-              <v:shape w14:anchorId="76E7A8F2" id="Conector recto de flecha 11" o:spid="_x0000_s1026" type="#_x0000_t32" style="position:absolute;margin-left:222.5pt;margin-top:29.5pt;width:124.5pt;height:25.5pt;flip:y;z-index:251673088;visibility:visible;mso-wrap-style:square;mso-width-percent:0;mso-height-percent:0;mso-wrap-distance-left:9pt;mso-wrap-distance-top:0;mso-wrap-distance-right:9pt;mso-wrap-distance-bottom:0;mso-position-horizontal:absolute;mso-position-horizontal-relative:text;mso-position-vertical:absolute;mso-position-vertical-relative:text;mso-width-percent:0;mso-height-percent:0;mso-width-relative:margin;mso-height-relative:margin" o:gfxdata="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" strokecolor="#196b24 [3206]" strokeweight="1.5pt">
+              <v:shape w14:anchorId="001A3A2F" id="Conector recto de flecha 11" o:spid="_x0000_s1026" type="#_x0000_t32" style="position:absolute;margin-left:222.5pt;margin-top:29.5pt;width:124.5pt;height:25.5pt;flip:y;z-index:251673088;visibility:visible;mso-wrap-style:square;mso-width-percent:0;mso-height-percent:0;mso-wrap-distance-left:9pt;mso-wrap-distance-top:0;mso-wrap-distance-right:9pt;mso-wrap-distance-bottom:0;mso-position-horizontal:absolute;mso-position-horizontal-relative:text;mso-position-vertical:absolute;mso-position-vertical-relative:text;mso-width-percent:0;mso-height-percent:0;mso-width-relative:margin;mso-height-relative:margin" o:gfxdata="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" strokecolor="#196b24 [3206]" strokeweight="1.5pt">
                 <v:stroke endarrow="block" joinstyle="miter"/>
               </v:shape>
             </w:pict>
@@ -2303,7 +2303,7 @@
           </mc:Choice>
           <mc:Fallback>
             <w:pict>
-              <v:line w14:anchorId="53302DE7" id="Conector recto 15" o:spid="_x0000_s1026" style="position:absolute;flip:y;z-index:251681792;visibility:visible;mso-wrap-style:square;mso-width-percent:0;mso-height-percent:0;mso-wrap-distance-left:9pt;mso-wrap-distance-top:0;mso-wrap-distance-right:9pt;mso-wrap-distance-bottom:0;mso-position-horizontal:absolute;mso-position-horizontal-relative:text;mso-position-vertical:absolute;mso-position-vertical-relative:text;mso-width-percent:0;mso-height-percent:0;mso-width-relative:margin;mso-height-relative:margin" from="0,11.5pt" to="222.5pt,11.5pt" o:gfxdata="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" strokecolor="#196b24 [3206]" strokeweight="1.5pt">
+              <v:line w14:anchorId="145CA23C" id="Conector recto 15" o:spid="_x0000_s1026" style="position:absolute;flip:y;z-index:251681792;visibility:visible;mso-wrap-style:square;mso-width-percent:0;mso-height-percent:0;mso-wrap-distance-left:9pt;mso-wrap-distance-top:0;mso-wrap-distance-right:9pt;mso-wrap-distance-bottom:0;mso-position-horizontal:absolute;mso-position-horizontal-relative:text;mso-position-vertical:absolute;mso-position-vertical-relative:text;mso-width-percent:0;mso-height-percent:0;mso-width-relative:margin;mso-height-relative:margin" from="0,11.5pt" to="222.5pt,11.5pt" o:gfxdata="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" strokecolor="#196b24 [3206]" strokeweight="1.5pt">
                 <v:stroke joinstyle="miter"/>
               </v:line>
             </w:pict>
@@ -2382,7 +2382,7 @@
           </mc:Choice>
           <mc:Fallback>
             <w:pict>
-              <v:shape w14:anchorId="239A166F" id="Conector recto de flecha 19" o:spid="_x0000_s1026" type="#_x0000_t32" style="position:absolute;margin-left:214.5pt;margin-top:53.8pt;width:135pt;height:90pt;flip:y;z-index:251684352;visibility:visible;mso-wrap-style:square;mso-width-percent:0;mso-height-percent:0;mso-wrap-distance-left:9pt;mso-wrap-distance-top:0;mso-wrap-distance-right:9pt;mso-wrap-distance-bottom:0;mso-position-horizontal:absolute;mso-position-horizontal-relative:text;mso-position-vertical:absolute;mso-position-vertical-relative:text;mso-width-percent:0;mso-height-percent:0;mso-width-relative:margin;mso-height-relative:margin" o:gfxdata="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" strokecolor="#196b24 [3206]" strokeweight="1.5pt">
+              <v:shape w14:anchorId="1503076A" id="Conector recto de flecha 19" o:spid="_x0000_s1026" type="#_x0000_t32" style="position:absolute;margin-left:214.5pt;margin-top:53.8pt;width:135pt;height:90pt;flip:y;z-index:251684352;visibility:visible;mso-wrap-style:square;mso-width-percent:0;mso-height-percent:0;mso-wrap-distance-left:9pt;mso-wrap-distance-top:0;mso-wrap-distance-right:9pt;mso-wrap-distance-bottom:0;mso-position-horizontal:absolute;mso-position-horizontal-relative:text;mso-position-vertical:absolute;mso-position-vertical-relative:text;mso-width-percent:0;mso-height-percent:0;mso-width-relative:margin;mso-height-relative:margin" o:gfxdata="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" strokecolor="#196b24 [3206]" strokeweight="1.5pt">
                 <v:stroke endarrow="block" joinstyle="miter"/>
               </v:shape>
             </w:pict>
@@ -2455,7 +2455,7 @@
           </mc:Choice>
           <mc:Fallback>
             <w:pict>
-              <v:shape w14:anchorId="1F6591FB" id="Conector recto de flecha 17" o:spid="_x0000_s1026" type="#_x0000_t32" style="position:absolute;margin-left:219.5pt;margin-top:12.3pt;width:127.5pt;height:74.5pt;flip:y;z-index:251680256;visibility:visible;mso-wrap-style:square;mso-width-percent:0;mso-height-percent:0;mso-wrap-distance-left:9pt;mso-wrap-distance-top:0;mso-wrap-distance-right:9pt;mso-wrap-distance-bottom:0;mso-position-horizontal:absolute;mso-position-horizontal-relative:text;mso-position-vertical:absolute;mso-position-vertical-relative:text;mso-width-percent:0;mso-height-percent:0;mso-width-relative:margin;mso-height-relative:margin" o:gfxdata="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" strokecolor="#196b24 [3206]" strokeweight="1.5pt">
+              <v:shape w14:anchorId="78191AEA" id="Conector recto de flecha 17" o:spid="_x0000_s1026" type="#_x0000_t32" style="position:absolute;margin-left:219.5pt;margin-top:12.3pt;width:127.5pt;height:74.5pt;flip:y;z-index:251680256;visibility:visible;mso-wrap-style:square;mso-width-percent:0;mso-height-percent:0;mso-wrap-distance-left:9pt;mso-wrap-distance-top:0;mso-wrap-distance-right:9pt;mso-wrap-distance-bottom:0;mso-position-horizontal:absolute;mso-position-horizontal-relative:text;mso-position-vertical:absolute;mso-position-vertical-relative:text;mso-width-percent:0;mso-height-percent:0;mso-width-relative:margin;mso-height-relative:margin" o:gfxdata="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" strokecolor="#196b24 [3206]" strokeweight="1.5pt">
                 <v:stroke endarrow="block" joinstyle="miter"/>
               </v:shape>
             </w:pict>
@@ -2572,7 +2572,7 @@
           </mc:Choice>
           <mc:Fallback>
             <w:pict>
-              <v:line w14:anchorId="215442E3" id="Conector recto 16" o:spid="_x0000_s1026" style="position:absolute;flip:y;z-index:251678208;visibility:visible;mso-wrap-style:square;mso-width-percent:0;mso-height-percent:0;mso-wrap-distance-left:9pt;mso-wrap-distance-top:0;mso-wrap-distance-right:9pt;mso-wrap-distance-bottom:0;mso-position-horizontal:absolute;mso-position-horizontal-relative:text;mso-position-vertical:absolute;mso-position-vertical-relative:text;mso-width-percent:0;mso-height-percent:0;mso-width-relative:margin;mso-height-relative:margin" from="-3pt,13.95pt" to="219.5pt,13.95pt" o:gfxdata="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" strokecolor="#196b24 [3206]" strokeweight="1.5pt">
+              <v:line w14:anchorId="1E9CE15F" id="Conector recto 16" o:spid="_x0000_s1026" style="position:absolute;flip:y;z-index:251678208;visibility:visible;mso-wrap-style:square;mso-width-percent:0;mso-height-percent:0;mso-wrap-distance-left:9pt;mso-wrap-distance-top:0;mso-wrap-distance-right:9pt;mso-wrap-distance-bottom:0;mso-position-horizontal:absolute;mso-position-horizontal-relative:text;mso-position-vertical:absolute;mso-position-vertical-relative:text;mso-width-percent:0;mso-height-percent:0;mso-width-relative:margin;mso-height-relative:margin" from="-3pt,13.95pt" to="219.5pt,13.95pt" o:gfxdata="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" strokecolor="#196b24 [3206]" strokeweight="1.5pt">
                 <v:stroke joinstyle="miter"/>
               </v:line>
             </w:pict>
@@ -2655,7 +2655,7 @@
           </mc:Choice>
           <mc:Fallback>
             <w:pict>
-              <v:shape w14:anchorId="215219F6" id="Conector recto de flecha 21" o:spid="_x0000_s1026" type="#_x0000_t32" style="position:absolute;margin-left:210.5pt;margin-top:22.5pt;width:151pt;height:132pt;flip:y;z-index:251686400;visibility:visible;mso-wrap-style:square;mso-width-percent:0;mso-height-percent:0;mso-wrap-distance-left:9pt;mso-wrap-distance-top:0;mso-wrap-distance-right:9pt;mso-wrap-distance-bottom:0;mso-position-horizontal:absolute;mso-position-horizontal-relative:text;mso-position-vertical:absolute;mso-position-vertical-relative:text;mso-width-percent:0;mso-height-percent:0;mso-width-relative:margin;mso-height-relative:margin" o:gfxdata="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" strokecolor="#e97132 [3205]" strokeweight="1.5pt">
+              <v:shape w14:anchorId="35041A9D" id="Conector recto de flecha 21" o:spid="_x0000_s1026" type="#_x0000_t32" style="position:absolute;margin-left:210.5pt;margin-top:22.5pt;width:151pt;height:132pt;flip:y;z-index:251686400;visibility:visible;mso-wrap-style:square;mso-width-percent:0;mso-height-percent:0;mso-wrap-distance-left:9pt;mso-wrap-distance-top:0;mso-wrap-distance-right:9pt;mso-wrap-distance-bottom:0;mso-position-horizontal:absolute;mso-position-horizontal-relative:text;mso-position-vertical:absolute;mso-position-vertical-relative:text;mso-width-percent:0;mso-height-percent:0;mso-width-relative:margin;mso-height-relative:margin" o:gfxdata="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" strokecolor="#e97132 [3205]" strokeweight="1.5pt">
                 <v:stroke endarrow="block" joinstyle="miter"/>
               </v:shape>
             </w:pict>
@@ -2764,7 +2764,7 @@
           </mc:Choice>
           <mc:Fallback>
             <w:pict>
-              <v:line w14:anchorId="0FFB9B2E" id="Conector recto 18" o:spid="_x0000_s1026" style="position:absolute;z-index:251681280;visibility:visible;mso-wrap-style:square;mso-wrap-distance-left:9pt;mso-wrap-distance-top:0;mso-wrap-distance-right:9pt;mso-wrap-distance-bottom:0;mso-position-horizontal:absolute;mso-position-horizontal-relative:text;mso-position-vertical:absolute;mso-position-vertical-relative:text" from=".5pt,12.95pt" to="214.5pt,12.95pt" o:gfxdata="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" strokecolor="#196b24 [3206]" strokeweight="1.5pt">
+              <v:line w14:anchorId="72338FC7" id="Conector recto 18" o:spid="_x0000_s1026" style="position:absolute;z-index:251681280;visibility:visible;mso-wrap-style:square;mso-wrap-distance-left:9pt;mso-wrap-distance-top:0;mso-wrap-distance-right:9pt;mso-wrap-distance-bottom:0;mso-position-horizontal:absolute;mso-position-horizontal-relative:text;mso-position-vertical:absolute;mso-position-vertical-relative:text" from=".5pt,12.95pt" to="214.5pt,12.95pt" o:gfxdata="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" strokecolor="#196b24 [3206]" strokeweight="1.5pt">
                 <v:stroke joinstyle="miter"/>
               </v:line>
             </w:pict>
@@ -2900,7 +2900,7 @@
           </mc:Choice>
           <mc:Fallback>
             <w:pict>
-              <v:line w14:anchorId="619BF09A" id="Conector recto 20" o:spid="_x0000_s1026" style="position:absolute;z-index:251689984;visibility:visible;mso-wrap-style:square;mso-wrap-distance-left:9pt;mso-wrap-distance-top:0;mso-wrap-distance-right:9pt;mso-wrap-distance-bottom:0;mso-position-horizontal:absolute;mso-position-horizontal-relative:text;mso-position-vertical:absolute;mso-position-vertical-relative:text" from=".5pt,9.1pt" to="210.5pt,9.1pt" o:gfxdata="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" strokecolor="#e97132 [3205]" strokeweight="1.5pt">
+              <v:line w14:anchorId="6E5375B4" id="Conector recto 20" o:spid="_x0000_s1026" style="position:absolute;z-index:251689984;visibility:visible;mso-wrap-style:square;mso-wrap-distance-left:9pt;mso-wrap-distance-top:0;mso-wrap-distance-right:9pt;mso-wrap-distance-bottom:0;mso-position-horizontal:absolute;mso-position-horizontal-relative:text;mso-position-vertical:absolute;mso-position-vertical-relative:text" from=".5pt,9.1pt" to="210.5pt,9.1pt" o:gfxdata="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" strokecolor="#e97132 [3205]" strokeweight="1.5pt">
                 <v:stroke joinstyle="miter"/>
               </v:line>
             </w:pict>
@@ -3264,7 +3264,7 @@
           </mc:Choice>
           <mc:Fallback>
             <w:pict>
-              <v:shape w14:anchorId="7CBE317E" id="Conector recto de flecha 27" o:spid="_x0000_s1026" type="#_x0000_t32" style="position:absolute;margin-left:213.5pt;margin-top:29.4pt;width:45.5pt;height:0;z-index:251698176;visibility:visible;mso-wrap-style:square;mso-wrap-distance-left:9pt;mso-wrap-distance-top:0;mso-wrap-distance-right:9pt;mso-wrap-distance-bottom:0;mso-position-horizontal:absolute;mso-position-horizontal-relative:text;mso-position-vertical:absolute;mso-position-vertical-relative:text" o:gfxdata="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" strokecolor="black [3200]" strokeweight="1.5pt">
+              <v:shape w14:anchorId="08B6DCC2" id="Conector recto de flecha 27" o:spid="_x0000_s1026" type="#_x0000_t32" style="position:absolute;margin-left:213.5pt;margin-top:29.4pt;width:45.5pt;height:0;z-index:251698176;visibility:visible;mso-wrap-style:square;mso-wrap-distance-left:9pt;mso-wrap-distance-top:0;mso-wrap-distance-right:9pt;mso-wrap-distance-bottom:0;mso-position-horizontal:absolute;mso-position-horizontal-relative:text;mso-position-vertical:absolute;mso-position-vertical-relative:text" o:gfxdata="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" strokecolor="black [3200]" strokeweight="1.5pt">
                 <v:stroke endarrow="block" joinstyle="miter"/>
               </v:shape>
             </w:pict>
@@ -3345,7 +3345,7 @@
           </mc:Choice>
           <mc:Fallback>
             <w:pict>
-              <v:shapetype w14:anchorId="74433ED0" id="_x0000_t34" coordsize="21600,21600" o:spt="34" o:oned="t" adj="10800" path="m,l@0,0@0,21600,21600,21600e" filled="f">
+              <v:shapetype w14:anchorId="3C8CCA90" id="_x0000_t34" coordsize="21600,21600" o:spt="34" o:oned="t" adj="10800" path="m,l@0,0@0,21600,21600,21600e" filled="f">
                 <v:stroke joinstyle="miter"/>
                 <v:formulas>
                   <v:f eqn="val #0"/>
@@ -3476,7 +3476,7 @@
           </mc:Choice>
           <mc:Fallback>
             <w:pict>
-              <v:shape w14:anchorId="75F95E53" id="Conector: angular 29" o:spid="_x0000_s1026" type="#_x0000_t34" style="position:absolute;margin-left:0;margin-top:.6pt;width:352.5pt;height:11pt;z-index:251692544;visibility:visible;mso-wrap-style:square;mso-width-percent:0;mso-height-percent:0;mso-wrap-distance-left:9pt;mso-wrap-distance-top:0;mso-wrap-distance-right:9pt;mso-wrap-distance-bottom:0;mso-position-horizontal:absolute;mso-position-horizontal-relative:text;mso-position-vertical:absolute;mso-position-vertical-relative:text;mso-width-percent:0;mso-height-percent:0;mso-width-relative:margin;mso-height-relative:margin" o:gfxdata="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" adj="14123" strokecolor="#196b24 [3206]" strokeweight="1.5pt">
+              <v:shape w14:anchorId="36EE4708" id="Conector: angular 29" o:spid="_x0000_s1026" type="#_x0000_t34" style="position:absolute;margin-left:0;margin-top:.6pt;width:352.5pt;height:11pt;z-index:251692544;visibility:visible;mso-wrap-style:square;mso-width-percent:0;mso-height-percent:0;mso-wrap-distance-left:9pt;mso-wrap-distance-top:0;mso-wrap-distance-right:9pt;mso-wrap-distance-bottom:0;mso-position-horizontal:absolute;mso-position-horizontal-relative:text;mso-position-vertical:absolute;mso-position-vertical-relative:text;mso-width-percent:0;mso-height-percent:0;mso-width-relative:margin;mso-height-relative:margin" o:gfxdata="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" adj="14123" strokecolor="#196b24 [3206]" strokeweight="1.5pt">
                 <v:stroke endarrow="block"/>
               </v:shape>
             </w:pict>
@@ -3566,7 +3566,7 @@
           </mc:Choice>
           <mc:Fallback>
             <w:pict>
-              <v:shape w14:anchorId="2677B39F" id="Conector recto de flecha 31" o:spid="_x0000_s1026" type="#_x0000_t32" style="position:absolute;margin-left:239pt;margin-top:21.65pt;width:91pt;height:19pt;z-index:251703296;visibility:visible;mso-wrap-style:square;mso-wrap-distance-left:9pt;mso-wrap-distance-top:0;mso-wrap-distance-right:9pt;mso-wrap-distance-bottom:0;mso-position-horizontal:absolute;mso-position-horizontal-relative:text;mso-position-vertical:absolute;mso-position-vertical-relative:text" o:gfxdata="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" strokecolor="#e97132 [3205]" strokeweight="1.5pt">
+              <v:shape w14:anchorId="1A273D6D" id="Conector recto de flecha 31" o:spid="_x0000_s1026" type="#_x0000_t32" style="position:absolute;margin-left:239pt;margin-top:21.65pt;width:91pt;height:19pt;z-index:251703296;visibility:visible;mso-wrap-style:square;mso-wrap-distance-left:9pt;mso-wrap-distance-top:0;mso-wrap-distance-right:9pt;mso-wrap-distance-bottom:0;mso-position-horizontal:absolute;mso-position-horizontal-relative:text;mso-position-vertical:absolute;mso-position-vertical-relative:text" o:gfxdata="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" strokecolor="#e97132 [3205]" strokeweight="1.5pt">
                 <v:stroke endarrow="block" joinstyle="miter"/>
               </v:shape>
             </w:pict>
@@ -3630,7 +3630,7 @@
           </mc:Choice>
           <mc:Fallback>
             <w:pict>
-              <v:line w14:anchorId="3275C835" id="Conector recto 30" o:spid="_x0000_s1026" style="position:absolute;z-index:251702272;visibility:visible;mso-wrap-style:square;mso-wrap-distance-left:9pt;mso-wrap-distance-top:0;mso-wrap-distance-right:9pt;mso-wrap-distance-bottom:0;mso-position-horizontal:absolute;mso-position-horizontal-relative:text;mso-position-vertical:absolute;mso-position-vertical-relative:text" from="0,18.65pt" to="239pt,21.65pt" o:gfxdata="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" strokecolor="#e97132 [3205]" strokeweight="1.5pt">
+              <v:line w14:anchorId="53689B8B" id="Conector recto 30" o:spid="_x0000_s1026" style="position:absolute;z-index:251702272;visibility:visible;mso-wrap-style:square;mso-wrap-distance-left:9pt;mso-wrap-distance-top:0;mso-wrap-distance-right:9pt;mso-wrap-distance-bottom:0;mso-position-horizontal:absolute;mso-position-horizontal-relative:text;mso-position-vertical:absolute;mso-position-vertical-relative:text" from="0,18.65pt" to="239pt,21.65pt" o:gfxdata="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" strokecolor="#e97132 [3205]" strokeweight="1.5pt">
                 <v:stroke joinstyle="miter"/>
               </v:line>
             </w:pict>
@@ -3778,6 +3778,186 @@
       </w:pPr>
       <w:r>
         <w:lastRenderedPageBreak/>
+        <w:drawing>
+          <wp:anchor distT="0" distB="0" distL="114300" distR="114300" simplePos="0" relativeHeight="251719680" behindDoc="1" locked="0" layoutInCell="1" allowOverlap="1" wp14:anchorId="6C9B5319" wp14:editId="19E674E2">
+            <wp:simplePos x="0" y="0"/>
+            <wp:positionH relativeFrom="column">
+              <wp:posOffset>246185</wp:posOffset>
+            </wp:positionH>
+            <wp:positionV relativeFrom="paragraph">
+              <wp:posOffset>298841</wp:posOffset>
+            </wp:positionV>
+            <wp:extent cx="2747010" cy="2019300"/>
+            <wp:effectExtent l="0" t="0" r="0" b="0"/>
+            <wp:wrapNone/>
+            <wp:docPr id="39" name="Imagen 39"/>
+            <wp:cNvGraphicFramePr>
+              <a:graphicFrameLocks xmlns:a="http://schemas.openxmlformats.org/drawingml/2006/main" noChangeAspect="1"/>
+            </wp:cNvGraphicFramePr>
+            <a:graphic xmlns:a="http://schemas.openxmlformats.org/drawingml/2006/main">
+              <a:graphicData uri="http://schemas.openxmlformats.org/drawingml/2006/picture">
+                <pic:pic xmlns:pic="http://schemas.openxmlformats.org/drawingml/2006/picture">
+                  <pic:nvPicPr>
+                    <pic:cNvPr id="1" name=""/>
+                    <pic:cNvPicPr/>
+                  </pic:nvPicPr>
+                  <pic:blipFill>
+                    <a:blip r:embed="rId10"/>
+                    <a:stretch>
+                      <a:fillRect/>
+                    </a:stretch>
+                  </pic:blipFill>
+                  <pic:spPr>
+                    <a:xfrm>
+                      <a:off x="0" y="0"/>
+                      <a:ext cx="2747010" cy="2019300"/>
+                    </a:xfrm>
+                    <a:prstGeom prst="rect">
+                      <a:avLst/>
+                    </a:prstGeom>
+                  </pic:spPr>
+                </pic:pic>
+              </a:graphicData>
+            </a:graphic>
+          </wp:anchor>
+        </w:drawing>
+      </w:r>
+      <w:r>
+        <w:drawing>
+          <wp:anchor distT="0" distB="0" distL="114300" distR="114300" simplePos="0" relativeHeight="251717632" behindDoc="1" locked="0" layoutInCell="1" allowOverlap="1" wp14:anchorId="15399002" wp14:editId="6A5F4FB1">
+            <wp:simplePos x="0" y="0"/>
+            <wp:positionH relativeFrom="column">
+              <wp:posOffset>281353</wp:posOffset>
+            </wp:positionH>
+            <wp:positionV relativeFrom="paragraph">
+              <wp:posOffset>2609557</wp:posOffset>
+            </wp:positionV>
+            <wp:extent cx="2747010" cy="2124710"/>
+            <wp:effectExtent l="0" t="0" r="0" b="8890"/>
+            <wp:wrapNone/>
+            <wp:docPr id="38" name="Imagen 38"/>
+            <wp:cNvGraphicFramePr>
+              <a:graphicFrameLocks xmlns:a="http://schemas.openxmlformats.org/drawingml/2006/main" noChangeAspect="1"/>
+            </wp:cNvGraphicFramePr>
+            <a:graphic xmlns:a="http://schemas.openxmlformats.org/drawingml/2006/main">
+              <a:graphicData uri="http://schemas.openxmlformats.org/drawingml/2006/picture">
+                <pic:pic xmlns:pic="http://schemas.openxmlformats.org/drawingml/2006/picture">
+                  <pic:nvPicPr>
+                    <pic:cNvPr id="1" name=""/>
+                    <pic:cNvPicPr/>
+                  </pic:nvPicPr>
+                  <pic:blipFill>
+                    <a:blip r:embed="rId11"/>
+                    <a:stretch>
+                      <a:fillRect/>
+                    </a:stretch>
+                  </pic:blipFill>
+                  <pic:spPr>
+                    <a:xfrm>
+                      <a:off x="0" y="0"/>
+                      <a:ext cx="2747010" cy="2124710"/>
+                    </a:xfrm>
+                    <a:prstGeom prst="rect">
+                      <a:avLst/>
+                    </a:prstGeom>
+                  </pic:spPr>
+                </pic:pic>
+              </a:graphicData>
+            </a:graphic>
+          </wp:anchor>
+        </w:drawing>
+      </w:r>
+      <w:r>
+        <w:drawing>
+          <wp:anchor distT="0" distB="0" distL="114300" distR="114300" simplePos="0" relativeHeight="251715584" behindDoc="1" locked="0" layoutInCell="1" allowOverlap="1" wp14:anchorId="5EC8152B" wp14:editId="7B84E576">
+            <wp:simplePos x="0" y="0"/>
+            <wp:positionH relativeFrom="column">
+              <wp:posOffset>3200400</wp:posOffset>
+            </wp:positionH>
+            <wp:positionV relativeFrom="paragraph">
+              <wp:posOffset>2609557</wp:posOffset>
+            </wp:positionV>
+            <wp:extent cx="2747010" cy="2061845"/>
+            <wp:effectExtent l="0" t="0" r="0" b="0"/>
+            <wp:wrapNone/>
+            <wp:docPr id="37" name="Imagen 37"/>
+            <wp:cNvGraphicFramePr>
+              <a:graphicFrameLocks xmlns:a="http://schemas.openxmlformats.org/drawingml/2006/main" noChangeAspect="1"/>
+            </wp:cNvGraphicFramePr>
+            <a:graphic xmlns:a="http://schemas.openxmlformats.org/drawingml/2006/main">
+              <a:graphicData uri="http://schemas.openxmlformats.org/drawingml/2006/picture">
+                <pic:pic xmlns:pic="http://schemas.openxmlformats.org/drawingml/2006/picture">
+                  <pic:nvPicPr>
+                    <pic:cNvPr id="1" name=""/>
+                    <pic:cNvPicPr/>
+                  </pic:nvPicPr>
+                  <pic:blipFill>
+                    <a:blip r:embed="rId12"/>
+                    <a:stretch>
+                      <a:fillRect/>
+                    </a:stretch>
+                  </pic:blipFill>
+                  <pic:spPr>
+                    <a:xfrm>
+                      <a:off x="0" y="0"/>
+                      <a:ext cx="2747010" cy="2061845"/>
+                    </a:xfrm>
+                    <a:prstGeom prst="rect">
+                      <a:avLst/>
+                    </a:prstGeom>
+                  </pic:spPr>
+                </pic:pic>
+              </a:graphicData>
+            </a:graphic>
+          </wp:anchor>
+        </w:drawing>
+      </w:r>
+      <w:r>
+        <w:drawing>
+          <wp:anchor distT="0" distB="0" distL="114300" distR="114300" simplePos="0" relativeHeight="251713536" behindDoc="1" locked="0" layoutInCell="1" allowOverlap="1" wp14:anchorId="6A8C8DE1" wp14:editId="4F2090BA">
+            <wp:simplePos x="0" y="0"/>
+            <wp:positionH relativeFrom="column">
+              <wp:posOffset>3200400</wp:posOffset>
+            </wp:positionH>
+            <wp:positionV relativeFrom="paragraph">
+              <wp:posOffset>147711</wp:posOffset>
+            </wp:positionV>
+            <wp:extent cx="2747010" cy="2170430"/>
+            <wp:effectExtent l="0" t="0" r="0" b="1270"/>
+            <wp:wrapNone/>
+            <wp:docPr id="36" name="Imagen 36"/>
+            <wp:cNvGraphicFramePr>
+              <a:graphicFrameLocks xmlns:a="http://schemas.openxmlformats.org/drawingml/2006/main" noChangeAspect="1"/>
+            </wp:cNvGraphicFramePr>
+            <a:graphic xmlns:a="http://schemas.openxmlformats.org/drawingml/2006/main">
+              <a:graphicData uri="http://schemas.openxmlformats.org/drawingml/2006/picture">
+                <pic:pic xmlns:pic="http://schemas.openxmlformats.org/drawingml/2006/picture">
+                  <pic:nvPicPr>
+                    <pic:cNvPr id="1" name=""/>
+                    <pic:cNvPicPr/>
+                  </pic:nvPicPr>
+                  <pic:blipFill>
+                    <a:blip r:embed="rId13"/>
+                    <a:stretch>
+                      <a:fillRect/>
+                    </a:stretch>
+                  </pic:blipFill>
+                  <pic:spPr>
+                    <a:xfrm>
+                      <a:off x="0" y="0"/>
+                      <a:ext cx="2747010" cy="2170430"/>
+                    </a:xfrm>
+                    <a:prstGeom prst="rect">
+                      <a:avLst/>
+                    </a:prstGeom>
+                  </pic:spPr>
+                </pic:pic>
+              </a:graphicData>
+            </a:graphic>
+          </wp:anchor>
+        </w:drawing>
+      </w:r>
+      <w:r>
         <w:t>.</w:t>
       </w:r>
       <w:r>

</xml_diff>